<commit_message>
chore: update 03a PGD template from user
</commit_message>
<xml_diff>
--- a/webapp/templates/TOTRINH/03a_Mau_Cong_van_gui_tu_2_don_vi_tro_len_PGD.docx
+++ b/webapp/templates/TOTRINH/03a_Mau_Cong_van_gui_tu_2_don_vi_tro_len_PGD.docx
@@ -225,8 +225,8 @@
               </w:rPr>
               <w:t xml:space="preserve">CỘNG HOÀ XÃ HỘI CHỦ NGHĨA VIỆT </w:t>
             </w:r>
-            <w:smartTag w:uri="urn:schemas-microsoft-com:office:smarttags" w:element="country-region">
-              <w:smartTag w:uri="urn:schemas-microsoft-com:office:smarttags" w:element="place">
+            <w:smartTag w:uri="urn:schemas-microsoft-com:office:smarttags" w:element="place">
+              <w:smartTag w:uri="urn:schemas-microsoft-com:office:smarttags" w:element="country-region">
                 <w:r>
                   <w:rPr>
                     <w:rFonts w:ascii="Times New Roman" w:hAnsi="Times New Roman"/>
@@ -325,18 +325,8 @@
                 <w:b/>
                 <w:szCs w:val="28"/>
               </w:rPr>
-              <w:t xml:space="preserve"> </w:t>
-            </w:r>
-            <w:proofErr w:type="spellStart"/>
-            <w:r>
-              <w:rPr>
-                <w:rFonts w:ascii="Times New Roman" w:hAnsi="Times New Roman"/>
-                <w:b/>
-                <w:szCs w:val="28"/>
-              </w:rPr>
-              <w:t>phúc</w:t>
-            </w:r>
-            <w:proofErr w:type="spellEnd"/>
+              <w:t xml:space="preserve"> phúc</w:t>
+            </w:r>
           </w:p>
           <w:p>
             <w:pPr>
@@ -1412,62 +1402,47 @@
               <w:jc w:val="center"/>
               <w:rPr>
                 <w:rFonts w:ascii="Times New Roman" w:hAnsi="Times New Roman"/>
-                <w:b/>
-                <w:spacing w:val="-6"/>
-                <w:szCs w:val="28"/>
-              </w:rPr>
-            </w:pPr>
-            <w:r>
-              <w:rPr>
-                <w:rFonts w:ascii="Times New Roman" w:hAnsi="Times New Roman"/>
-                <w:b/>
-                <w:bCs/>
-                <w:spacing w:val="-6"/>
-                <w:szCs w:val="28"/>
-              </w:rPr>
-              <w:t xml:space="preserve">GIÁM </w:t>
-            </w:r>
-            <w:proofErr w:type="gramStart"/>
-            <w:r>
-              <w:rPr>
-                <w:rFonts w:ascii="Times New Roman" w:hAnsi="Times New Roman"/>
-                <w:b/>
-                <w:bCs/>
-                <w:spacing w:val="-6"/>
-                <w:szCs w:val="28"/>
-              </w:rPr>
-              <w:t>ĐỐC</w:t>
-            </w:r>
-            <w:r>
-              <w:rPr>
-                <w:rFonts w:ascii="Times New Roman" w:hAnsi="Times New Roman"/>
                 <w:bCs/>
                 <w:spacing w:val="-6"/>
                 <w:sz w:val="24"/>
                 <w:szCs w:val="24"/>
-              </w:rPr>
-              <w:t>(</w:t>
-            </w:r>
-            <w:proofErr w:type="gramEnd"/>
-            <w:r>
-              <w:rPr>
-                <w:rFonts w:ascii="Times New Roman" w:hAnsi="Times New Roman"/>
+                <w:lang w:val="vi-VN"/>
+              </w:rPr>
+            </w:pPr>
+            <w:r>
+              <w:rPr>
+                <w:rFonts w:ascii="Times New Roman" w:hAnsi="Times New Roman"/>
+                <w:b/>
                 <w:bCs/>
                 <w:spacing w:val="-6"/>
-                <w:sz w:val="24"/>
-                <w:szCs w:val="24"/>
-              </w:rPr>
-              <w:t>5</w:t>
-            </w:r>
-            <w:r>
-              <w:rPr>
-                <w:rFonts w:ascii="Times New Roman" w:hAnsi="Times New Roman"/>
-                <w:bCs/>
+                <w:szCs w:val="28"/>
+              </w:rPr>
+              <w:t>GIÁM ĐỐC</w:t>
+            </w:r>
+          </w:p>
+          <w:p>
+            <w:pPr>
+              <w:ind w:right="-1"/>
+              <w:jc w:val="center"/>
+              <w:rPr>
+                <w:rFonts w:ascii="Times New Roman" w:hAnsi="Times New Roman"/>
+                <w:b/>
                 <w:spacing w:val="-6"/>
-                <w:sz w:val="24"/>
-                <w:szCs w:val="24"/>
-              </w:rPr>
-              <w:t>)</w:t>
+                <w:sz w:val="26"/>
+                <w:szCs w:val="26"/>
+                <w:lang w:val="vi-VN"/>
+              </w:rPr>
+            </w:pPr>
+            <w:r>
+              <w:rPr>
+                <w:rFonts w:ascii="Times New Roman" w:hAnsi="Times New Roman"/>
+                <w:b/>
+                <w:spacing w:val="-6"/>
+                <w:sz w:val="26"/>
+                <w:szCs w:val="26"/>
+                <w:lang w:val="vi-VN"/>
+              </w:rPr>
+              <w:t>PHÓ GIÁM ĐỐC</w:t>
             </w:r>
           </w:p>
           <w:p>
@@ -1488,78 +1463,9 @@
                 <w:rFonts w:ascii="Times New Roman" w:hAnsi="Times New Roman"/>
                 <w:bCs/>
                 <w:i/>
+                <w:lang w:val="vi-VN"/>
               </w:rPr>
             </w:pPr>
-            <w:r>
-              <w:rPr>
-                <w:rFonts w:ascii="Times New Roman" w:hAnsi="Times New Roman"/>
-                <w:bCs/>
-                <w:i/>
-              </w:rPr>
-              <w:t>(</w:t>
-            </w:r>
-            <w:proofErr w:type="spellStart"/>
-            <w:r>
-              <w:rPr>
-                <w:rFonts w:ascii="Times New Roman" w:hAnsi="Times New Roman"/>
-                <w:bCs/>
-                <w:i/>
-              </w:rPr>
-              <w:t>ký</w:t>
-            </w:r>
-            <w:proofErr w:type="spellEnd"/>
-            <w:r>
-              <w:rPr>
-                <w:rFonts w:ascii="Times New Roman" w:hAnsi="Times New Roman"/>
-                <w:bCs/>
-                <w:i/>
-              </w:rPr>
-              <w:t>,</w:t>
-            </w:r>
-            <w:r>
-              <w:rPr>
-                <w:rFonts w:ascii="Times New Roman" w:hAnsi="Times New Roman"/>
-                <w:bCs/>
-                <w:i/>
-              </w:rPr>
-              <w:t xml:space="preserve"> </w:t>
-            </w:r>
-            <w:proofErr w:type="spellStart"/>
-            <w:r>
-              <w:rPr>
-                <w:rFonts w:ascii="Times New Roman" w:hAnsi="Times New Roman"/>
-                <w:bCs/>
-                <w:i/>
-              </w:rPr>
-              <w:t>đóng</w:t>
-            </w:r>
-            <w:proofErr w:type="spellEnd"/>
-            <w:r>
-              <w:rPr>
-                <w:rFonts w:ascii="Times New Roman" w:hAnsi="Times New Roman"/>
-                <w:bCs/>
-                <w:i/>
-              </w:rPr>
-              <w:t xml:space="preserve"> </w:t>
-            </w:r>
-            <w:proofErr w:type="spellStart"/>
-            <w:r>
-              <w:rPr>
-                <w:rFonts w:ascii="Times New Roman" w:hAnsi="Times New Roman"/>
-                <w:bCs/>
-                <w:i/>
-              </w:rPr>
-              <w:t>dấu</w:t>
-            </w:r>
-            <w:proofErr w:type="spellEnd"/>
-            <w:r>
-              <w:rPr>
-                <w:rFonts w:ascii="Times New Roman" w:hAnsi="Times New Roman"/>
-                <w:bCs/>
-                <w:i/>
-              </w:rPr>
-              <w:t>)</w:t>
-            </w:r>
           </w:p>
           <w:p>
             <w:pPr>
@@ -1604,30 +1510,8 @@
               <w:rPr>
                 <w:rFonts w:ascii="Times New Roman" w:hAnsi="Times New Roman"/>
               </w:rPr>
-              <w:t xml:space="preserve"> </w:t>
-            </w:r>
-            <w:proofErr w:type="spellStart"/>
-            <w:r>
-              <w:rPr>
-                <w:rFonts w:ascii="Times New Roman" w:hAnsi="Times New Roman"/>
-              </w:rPr>
-              <w:t>và</w:t>
-            </w:r>
-            <w:proofErr w:type="spellEnd"/>
-            <w:r>
-              <w:rPr>
-                <w:rFonts w:ascii="Times New Roman" w:hAnsi="Times New Roman"/>
-              </w:rPr>
-              <w:t xml:space="preserve"> </w:t>
-            </w:r>
-            <w:proofErr w:type="spellStart"/>
-            <w:r>
-              <w:rPr>
-                <w:rFonts w:ascii="Times New Roman" w:hAnsi="Times New Roman"/>
-              </w:rPr>
-              <w:t>tên</w:t>
-            </w:r>
-            <w:proofErr w:type="spellEnd"/>
+              <w:t xml:space="preserve"> và tên</w:t>
+            </w:r>
             <w:r>
               <w:rPr>
                 <w:rFonts w:ascii="Times New Roman" w:hAnsi="Times New Roman"/>

</xml_diff>